<commit_message>
fix: isolate structural signal in Scenario A and exercise PDF page-break path
- Strip numbering prefix from Scenario A headings so they no longer
  incidentally match HEADING_NUMBER_PATTERN in backend/app/sectioning.py,
  making A actually isolate the structural (Word-style/PDF-TOC) signal
  it's meant to test.
- Lower PAGE_USABLE_BOTTOM from 720 to 450 so the larger fixtures (C1,
  SOP) genuinely span 2 PDF pages, exercising write_pdf's page-break
  branch and multi-page TOC/page-number tagging, which was previously
  shipped but never triggered by any fixture.
- Regenerate and commit all 20 DOCX/PDF fixtures so the working tree is
  clean after re-running the generator.
</commit_message>
<xml_diff>
--- a/test-documents/docx/A_v1.docx
+++ b/test-documents/docx/A_v1.docx
@@ -7,7 +7,7 @@
         <w:pStyle w:val="Heading1"/>
       </w:pPr>
       <w:r>
-        <w:t>1.0 Effective Date</w:t>
+        <w:t>Effective Date</w:t>
       </w:r>
     </w:p>
     <w:p>
@@ -20,7 +20,7 @@
         <w:pStyle w:val="Heading1"/>
       </w:pPr>
       <w:r>
-        <w:t>2.0 Storage Temperature</w:t>
+        <w:t>Storage Temperature</w:t>
       </w:r>
     </w:p>
     <w:p>
@@ -33,7 +33,7 @@
         <w:pStyle w:val="Heading1"/>
       </w:pPr>
       <w:r>
-        <w:t>3.0 Batch Size</w:t>
+        <w:t>Batch Size</w:t>
       </w:r>
     </w:p>
     <w:p>
@@ -46,7 +46,7 @@
         <w:pStyle w:val="Heading1"/>
       </w:pPr>
       <w:r>
-        <w:t>4.0 Reference Standard Weighing</w:t>
+        <w:t>Reference Standard Weighing</w:t>
       </w:r>
     </w:p>
     <w:p>
@@ -59,7 +59,7 @@
         <w:pStyle w:val="Heading1"/>
       </w:pPr>
       <w:r>
-        <w:t>5.0 Container Specification</w:t>
+        <w:t>Container Specification</w:t>
       </w:r>
     </w:p>
     <w:p>
@@ -72,7 +72,7 @@
         <w:pStyle w:val="Heading1"/>
       </w:pPr>
       <w:r>
-        <w:t>6.0 Calibration Frequency</w:t>
+        <w:t>Calibration Frequency</w:t>
       </w:r>
     </w:p>
     <w:p>

</xml_diff>